<commit_message>
Caption sweep after the FN3 audit: collapse graph descriptions that gave answers away (FN2, EL2 graph 2, PR5 cz3, PR7 sk3); reword FN1 sideways parabola and PR6 'where it meets'; regenerate affected Canvas quizzes and docs; audit notes
Co-Authored-By: Claude Opus 5.5 <noreply@anthropic.com>
Claude-Session: https://claude.ai/code/session_013Y8PfETWcMLvmUEpCdE8Wq
</commit_message>
<xml_diff>
--- a/support-materials/FN1/FN1_worked_examples.docx
+++ b/support-materials/FN1/FN1_worked_examples.docx
@@ -1409,7 +1409,7 @@
           <wp:inline distT="0" distB="0" distL="0" distR="0">
             <wp:extent cx="3133725" cy="3143250"/>
             <wp:effectExtent t="0" r="0" b="0" l="0"/>
-            <wp:docPr id="1" name="graph2" descr="A smooth curve extending to the right from a leftmost point. Plotted data: a smooth curve whose leftmost point is at (-4, 0). It extends to the right and passes through approximately (-1.1, 1.7), (-1.1, -1.7), (1.8, 2.4), and (1.8, -2.4)." title="A smooth curve extending to the right from a leftmost point"/>
+            <wp:docPr id="1" name="graph2" descr="A smooth curve extending to the right from a leftmost point. Plotted data: a smooth curve shaped like a parabola opening to the right. Its leftmost point is (-4, 0). One branch rises toward the upper right, reaching about (1.8, 2.4) at the edge of the grid, and the other falls toward the lower right, reaching about (1.8, -2.4)." title="A smooth curve extending to the right from a leftmost point"/>
             <wp:cNvGraphicFramePr>
               <a:graphicFrameLocks xmlns:a="http://schemas.openxmlformats.org/drawingml/2006/main" noChangeAspect="1"/>
             </wp:cNvGraphicFramePr>
@@ -1463,7 +1463,7 @@
           <w:sz w:val="22"/>
           <w:szCs w:val="22"/>
         </w:rPr>
-        <w:t xml:space="preserve">a smooth curve whose leftmost point is at </w:t>
+        <w:t xml:space="preserve">a smooth curve shaped like a parabola opening to the right. Its leftmost point is </w:t>
       </w:r>
       <w:r>
         <w:rPr>
@@ -1479,7 +1479,7 @@
           <w:sz w:val="22"/>
           <w:szCs w:val="22"/>
         </w:rPr>
-        <w:t xml:space="preserve">. It extends to the right and passes through approximately </w:t>
+        <w:t xml:space="preserve">. One branch rises toward the upper right, reaching about </w:t>
       </w:r>
       <w:r>
         <w:rPr>
@@ -1488,46 +1488,14 @@
           <w:sz w:val="22"/>
           <w:szCs w:val="22"/>
         </w:rPr>
-        <w:t xml:space="preserve">(−1.1, 1.7)</w:t>
+        <w:t xml:space="preserve">(1.8, 2.4)</w:t>
       </w:r>
       <w:r>
         <w:rPr>
           <w:sz w:val="22"/>
           <w:szCs w:val="22"/>
         </w:rPr>
-        <w:t xml:space="preserve">, </w:t>
-      </w:r>
-      <w:r>
-        <w:rPr>
-          <w:i/>
-          <w:iCs/>
-          <w:sz w:val="22"/>
-          <w:szCs w:val="22"/>
-        </w:rPr>
-        <w:t xml:space="preserve">(−1.1, −1.7)</w:t>
-      </w:r>
-      <w:r>
-        <w:rPr>
-          <w:sz w:val="22"/>
-          <w:szCs w:val="22"/>
-        </w:rPr>
-        <w:t xml:space="preserve">, </w:t>
-      </w:r>
-      <w:r>
-        <w:rPr>
-          <w:i/>
-          <w:iCs/>
-          <w:sz w:val="22"/>
-          <w:szCs w:val="22"/>
-        </w:rPr>
-        <w:t xml:space="preserve">(1.8, 2.4)</w:t>
-      </w:r>
-      <w:r>
-        <w:rPr>
-          <w:sz w:val="22"/>
-          <w:szCs w:val="22"/>
-        </w:rPr>
-        <w:t xml:space="preserve">, and </w:t>
+        <w:t xml:space="preserve"> at the edge of the grid, and the other falls toward the lower right, reaching about </w:t>
       </w:r>
       <w:r>
         <w:rPr>
@@ -2948,7 +2916,7 @@
           <wp:inline distT="0" distB="0" distL="0" distR="0">
             <wp:extent cx="2466975" cy="2476500"/>
             <wp:effectExtent t="0" r="0" b="0" l="0"/>
-            <wp:docPr id="1" name="sl5" descr="A smooth curve extending to the right from a leftmost point. Plotted data: a smooth curve whose leftmost point is at (-4, 0). It extends to the right and passes through approximately (-1.1, 1.7), (-1.1, -1.7), (1.8, 2.4), and (1.8, -2.4)." title="A smooth curve extending to the right from a leftmost point"/>
+            <wp:docPr id="1" name="sl5" descr="A smooth curve extending to the right from a leftmost point. Plotted data: a smooth curve shaped like a parabola opening to the right. Its leftmost point is (-4, 0). One branch rises toward the upper right, reaching about (1.8, 2.4) at the edge of the grid, and the other falls toward the lower right, reaching about (1.8, -2.4)." title="A smooth curve extending to the right from a leftmost point"/>
             <wp:cNvGraphicFramePr>
               <a:graphicFrameLocks xmlns:a="http://schemas.openxmlformats.org/drawingml/2006/main" noChangeAspect="1"/>
             </wp:cNvGraphicFramePr>
@@ -3002,7 +2970,7 @@
           <w:sz w:val="22"/>
           <w:szCs w:val="22"/>
         </w:rPr>
-        <w:t xml:space="preserve">a smooth curve whose leftmost point is at </w:t>
+        <w:t xml:space="preserve">a smooth curve shaped like a parabola opening to the right. Its leftmost point is </w:t>
       </w:r>
       <w:r>
         <w:rPr>
@@ -3018,7 +2986,7 @@
           <w:sz w:val="22"/>
           <w:szCs w:val="22"/>
         </w:rPr>
-        <w:t xml:space="preserve">. It extends to the right and passes through approximately </w:t>
+        <w:t xml:space="preserve">. One branch rises toward the upper right, reaching about </w:t>
       </w:r>
       <w:r>
         <w:rPr>
@@ -3027,46 +2995,14 @@
           <w:sz w:val="22"/>
           <w:szCs w:val="22"/>
         </w:rPr>
-        <w:t xml:space="preserve">(−1.1, 1.7)</w:t>
+        <w:t xml:space="preserve">(1.8, 2.4)</w:t>
       </w:r>
       <w:r>
         <w:rPr>
           <w:sz w:val="22"/>
           <w:szCs w:val="22"/>
         </w:rPr>
-        <w:t xml:space="preserve">, </w:t>
-      </w:r>
-      <w:r>
-        <w:rPr>
-          <w:i/>
-          <w:iCs/>
-          <w:sz w:val="22"/>
-          <w:szCs w:val="22"/>
-        </w:rPr>
-        <w:t xml:space="preserve">(−1.1, −1.7)</w:t>
-      </w:r>
-      <w:r>
-        <w:rPr>
-          <w:sz w:val="22"/>
-          <w:szCs w:val="22"/>
-        </w:rPr>
-        <w:t xml:space="preserve">, </w:t>
-      </w:r>
-      <w:r>
-        <w:rPr>
-          <w:i/>
-          <w:iCs/>
-          <w:sz w:val="22"/>
-          <w:szCs w:val="22"/>
-        </w:rPr>
-        <w:t xml:space="preserve">(1.8, 2.4)</w:t>
-      </w:r>
-      <w:r>
-        <w:rPr>
-          <w:sz w:val="22"/>
-          <w:szCs w:val="22"/>
-        </w:rPr>
-        <w:t xml:space="preserve">, and </w:t>
+        <w:t xml:space="preserve"> at the edge of the grid, and the other falls toward the lower right, reaching about </w:t>
       </w:r>
       <w:r>
         <w:rPr>

</xml_diff>